<commit_message>
FOVI 2026: carta UdeC con investigadora María Elena Lagos
Co-Authored-By: Claude Sonnet 5.5 <noreply@anthropic.com>
Claude-Session: https://claude.ai/code/session_01P4g3Yf3jcPuX77QSmk15pC
</commit_message>
<xml_diff>
--- a/fovi2026/cartas/Carta_UdeC_nacional_asociada_ES.docx
+++ b/fovi2026/cartas/Carta_UdeC_nacional_asociada_ES.docx
@@ -471,7 +471,7 @@
               </w:rPr>
             </w:pPr>
             <w:r>
-              <w:t>[Nombres de la investigadora/or de Concepción]</w:t>
+              <w:t>María Elena</w:t>
             </w:r>
           </w:p>
         </w:tc>
@@ -489,7 +489,7 @@
               </w:rPr>
             </w:pPr>
             <w:r>
-              <w:t>[Apellidos]</w:t>
+              <w:t>Lagos [segundo apellido]</w:t>
             </w:r>
           </w:p>
         </w:tc>

</xml_diff>